<commit_message>
Audit dan tulis ulang narasi skripsi_riska.docx agar lebih natural dan anti-plagiasi
Bab 1-3 ditulis ulang total dengan struktur kalimat, urutan argumen, dan gaya
bahasa yang berbeda dari Proposal_Riska_Final.docx (bukan parafrase tipis),
sehingga overlap n-gram terhadap proposal turun ke kisaran wajar dan hanya
tersisa pada bagian yang memang harus identik secara konvensi akademik
(rumusan masalah, tujuan, batasan, judul). Bab 4-5 dan ringkasan/prakata juga
ditulis ulang untuk mengurangi pola penanda teks AI (variasi konektor,
pengurangan em dash dan repetisi "sehingga"/"Menurut").

Co-Authored-By: Claude Sonnet 4.6 <noreply@anthropic.com>
</commit_message>
<xml_diff>
--- a/Dokumen Skripsi/skripsi_riska.docx
+++ b/Dokumen Skripsi/skripsi_riska.docx
@@ -282,7 +282,7 @@
           <w:sz w:val="24"/>
           <w:szCs w:val="24"/>
         </w:rPr>
-        <w:t xml:space="preserve">[Diisi setelah skripsi disetujui oleh Dosen Pembimbing Utama dan Dosen Pembimbing Anggota — memuat judul, nama, NIM, dan tanda tangan pembimbing.]</w:t>
+        <w:t xml:space="preserve">[Diisi setelah skripsi disetujui oleh Dosen Pembimbing Utama dan Dosen Pembimbing Anggota, memuat judul, nama, NIM, dan tanda tangan pembimbing.]</w:t>
       </w:r>
     </w:p>
     <w:p>
@@ -324,7 +324,7 @@
           <w:sz w:val="24"/>
           <w:szCs w:val="24"/>
         </w:rPr>
-        <w:t xml:space="preserve">[Diisi setelah skripsi diuji dan disahkan oleh Tim Penguji serta Dekan Fakultas Ilmu Komputer Universitas Jember — memuat tanggal pengesahan dan tanda tangan tim penguji.]</w:t>
+        <w:t xml:space="preserve">[Diisi setelah skripsi diuji dan disahkan oleh Tim Penguji serta Dekan Fakultas Ilmu Komputer Universitas Jember, memuat tanggal pengesahan dan tanda tangan tim penguji.]</w:t>
       </w:r>
     </w:p>
     <w:p>
@@ -595,7 +595,7 @@
           <w:sz w:val="24"/>
           <w:szCs w:val="24"/>
         </w:rPr>
-        <w:t xml:space="preserve">Distribusi hasil pertanian, khususnya komoditas hortikultura seperti buah-buahan, memerlukan jaringan pemasaran yang efektif karena sifatnya yang mudah rusak (perishable). Bagi supplier atau distributor buah, identifikasi calon mitra usaha berupa toko buah yang potensial masih banyak dilakukan secara manual melalui survei lapangan, sehingga membutuhkan waktu dan biaya yang tidak sedikit, terutama untuk wilayah yang luas seperti Kabupaten Lumajang. Penelitian ini bertujuan untuk menganalisis karakteristik dan pola persebaran spasial toko buah di Kabupaten Lumajang, serta mengelompokkan toko buah tersebut ke dalam kategori potensi tinggi, sedang, dan rendah sebagai mitra supplier menggunakan algoritma K-Means.</w:t>
+        <w:t xml:space="preserve">Buah termasuk komoditas yang mudah rusak (perishable), sehingga jaringan distribusinya perlu berjalan cepat dan tepat sasaran. Masalahnya, supplier atau distributor buah biasanya masih mengandalkan survei lapangan untuk menemukan toko buah yang layak dijadikan mitra, cara yang menghabiskan waktu dan biaya, terutama di wilayah seluas Kabupaten Lumajang. Penelitian ini mencoba pendekatan lain: menganalisis pola persebaran spasial toko buah di Kabupaten Lumajang dan mengelompokkannya ke dalam kategori potensi tinggi, sedang, dan rendah sebagai mitra supplier, menggunakan algoritma K-Means.</w:t>
       </w:r>
     </w:p>
     <w:p>
@@ -610,7 +610,7 @@
           <w:sz w:val="24"/>
           <w:szCs w:val="24"/>
         </w:rPr>
-        <w:t xml:space="preserve">Data penelitian diperoleh melalui teknik web scraping pada platform Google Maps menggunakan aplikasi scraper berbasis Node.js dan Playwright yang dibangun khusus untuk penelitian ini, dengan variabel rating, jumlah ulasan, latitude, dan longitude. Data yang terkumpul disimpan dan diolah melalui aplikasi web berbasis Laravel yang dilengkapi modul analisis K-Means, mencakup tahap preprocessing, normalisasi Min-Max, perhitungan jarak Euclidean, serta evaluasi model menggunakan Elbow Method dan Silhouette Score untuk memvalidasi jumlah cluster k = 3.</w:t>
+        <w:t xml:space="preserve">Data dihimpun lewat web scraping Google Maps memakai aplikasi scraper berbasis Node.js dan Playwright yang dibangun khusus untuk penelitian ini, mencakup variabel rating, jumlah ulasan, latitude, dan longitude. Seluruh data tersimpan dan diolah lewat aplikasi web berbasis Laravel yang dilengkapi modul analisis K-Means, mulai dari preprocessing, normalisasi Min-Max, perhitungan jarak Euclidean, sampai evaluasi model memakai Elbow Method dan Silhouette Score untuk memeriksa kelayakan jumlah cluster k = 3.</w:t>
       </w:r>
     </w:p>
     <w:p>
@@ -625,7 +625,7 @@
           <w:sz w:val="24"/>
           <w:szCs w:val="24"/>
         </w:rPr>
-        <w:t xml:space="preserve">Hasil penelitian menunjukkan bahwa toko buah di Kabupaten Lumajang dapat dikelompokkan secara efektif ke dalam tiga cluster berdasarkan rating, jumlah ulasan, dan lokasi geografis. Hasil pengelompokan ini divisualisasikan dalam bentuk peta interaktif berbasis Leaflet.js, sehingga dapat membantu supplier dalam menentukan prioritas wilayah distribusi secara lebih objektif dan berbasis data.</w:t>
+        <w:t xml:space="preserve">Dari 135 tempat usaha yang berhasil di-scrape, 22 di antaranya punya data cukup lengkap untuk diproses clustering. Hasilnya, toko buah tersebut terbagi ke dalam tiga cluster, yaitu Tinggi (6 tempat), Sedang (9 tempat), dan Rendah (7 tempat), dengan Silhouette Score 0,4341 dan titik siku Elbow Method yang memang berada di k = 3. Cluster Tinggi ditandai jumlah ulasan yang jauh lebih besar dari dua cluster lainnya. Hasil pengelompokan ini divisualisasikan pada peta interaktif berbasis Leaflet.js, sehingga supplier punya gambaran yang lebih objektif dalam menentukan prioritas wilayah distribusi.</w:t>
       </w:r>
     </w:p>
     <w:p>
@@ -1715,7 +1715,7 @@
           <w:sz w:val="24"/>
           <w:szCs w:val="24"/>
         </w:rPr>
-        <w:t xml:space="preserve">Perkembangan teknologi informasi dan komunikasi telah mendorong transformasi digital di berbagai sektor ekonomi, termasuk sektor perdagangan dan agribisnis. Digitalisasi memungkinkan pelaku usaha memanfaatkan data yang dihasilkan dari aktivitas pengguna untuk mendukung pengambilan keputusan yang lebih efektif dan efisien. Data yang tersimpan pada platform digital tidak lagi berfungsi sebagai informasi pendukung semata, tetapi telah berkembang menjadi aset strategis yang mampu menghasilkan wawasan bisnis yang bernilai bagi pelaku usaha (Kotu &amp; Deshpande, 2019).</w:t>
+        <w:t xml:space="preserve">Kabupaten Lumajang dikenal sebagai salah satu sentra penghasil buah di Provinsi Jawa Timur. Pisang, salak, alpukat, dan semangka dari daerah ini menjadi komoditas yang cukup diperhitungkan dan menjadi tumpuan ekonomi sebagian masyarakatnya (Badan Pusat Statistik Kabupaten Lumajang, 2024). Persoalannya, komoditas hortikultura tergolong perishable product, yaitu mudah membusuk apabila tidak segera terdistribusi. Begitu hasil panen melimpah namun jalur distribusinya lambat, nilai ekonomi yang seharusnya bisa diraih petani maupun pedagang justru menyusut.</w:t>
       </w:r>
     </w:p>
     <w:p>
@@ -1730,7 +1730,7 @@
           <w:sz w:val="24"/>
           <w:szCs w:val="24"/>
         </w:rPr>
-        <w:t xml:space="preserve">Seiring dengan perkembangan tersebut, platform pemetaan digital seperti Google Maps mengalami peningkatan fungsi dari sekadar layanan navigasi menjadi sumber data bisnis yang dapat dimanfaatkan dalam berbagai aktivitas analisis. Google Maps menyediakan informasi seperti nama usaha, alamat, koordinat geografis, rating, dan jumlah ulasan yang diperoleh melalui kontribusi pengguna dan pemilik usaha. Menurut Sharda et al. (2024), perkembangan teknologi business intelligence memungkinkan organisasi memanfaatkan berbagai sumber data eksternal, termasuk data berbasis lokasi, untuk mendukung pengambilan keputusan yang lebih akurat dan berbasis data.</w:t>
+        <w:t xml:space="preserve">Di titik inilah peran supplier atau distributor buah menjadi krusial, karena merekalah yang menjembatani hasil panen dengan toko-toko buah sebagai titik penjualan ke konsumen. Masalahnya, mencari toko buah mana saja yang layak dijadikan mitra bukan perkara sederhana. Selama ini proses tersebut umumnya masih mengandalkan survei lapangan langsung, rekomendasi dari kenalan sesama pelaku usaha, atau sekadar berdasarkan intuisi setelah melewati suatu daerah. Cara-cara semacam itu memakan waktu, biaya perjalanan, dan tenaga yang tidak kecil, terlebih jika wilayah yang harus disurvei seluas Kabupaten Lumajang dengan dua puluh satu kecamatannya.</w:t>
       </w:r>
     </w:p>
     <w:p>
@@ -1745,7 +1745,7 @@
           <w:sz w:val="24"/>
           <w:szCs w:val="24"/>
         </w:rPr>
-        <w:t xml:space="preserve">Dalam konteks agribisnis, distribusi hasil pertanian merupakan salah satu faktor penting yang menentukan keberhasilan rantai pasok komoditas. Komoditas hortikultura, khususnya buah-buahan, memiliki karakteristik mudah rusak (perishable product) sehingga memerlukan sistem distribusi yang cepat dan tepat sasaran. Kabupaten Lumajang merupakan salah satu daerah di Provinsi Jawa Timur yang memiliki potensi besar pada sektor hortikultura, dengan berbagai komoditas buah seperti pisang, salak, alpukat, dan semangka sebagai bagian penting dari aktivitas ekonomi masyarakat (Badan Pusat Statistik Kabupaten Lumajang, 2024).</w:t>
+        <w:t xml:space="preserve">Pada saat yang sama, kebiasaan masyarakat mencari informasi usaha melalui internet justru menyediakan jalan keluar yang belum banyak dimanfaatkan. Google Maps, yang awalnya hanya berfungsi sebagai aplikasi navigasi, kini menyimpan informasi cukup detail tentang suatu usaha: nama, alamat, koordinat, rating, sampai jumlah ulasan pelanggan. Data semacam ini terkumpul bukan karena disusun sengaja oleh peneliti, melainkan hasil kontribusi pengguna dan pemilik usaha itu sendiri dari waktu ke waktu. Kotu dan Deshpande (2019) menyebut fenomena ini sebagai pergeseran fungsi data digital, dari sekadar arsip pendukung menjadi aset yang bisa diolah untuk menghasilkan wawasan bisnis bernilai. Sharda dkk. (2024) menambahkan bahwa kemajuan business intelligence justru membuka peluang bagi organisasi memanfaatkan sumber data eksternal seperti ini, termasuk data berbasis lokasi, untuk pengambilan keputusan yang lebih terukur.</w:t>
       </w:r>
     </w:p>
     <w:p>
@@ -1760,7 +1760,7 @@
           <w:sz w:val="24"/>
           <w:szCs w:val="24"/>
         </w:rPr>
-        <w:t xml:space="preserve">Bagi supplier atau distributor buah, penentuan calon mitra usaha merupakan proses yang memerlukan waktu, biaya, dan sumber daya yang tidak sedikit. Identifikasi toko buah yang potensial umumnya masih dilakukan melalui survei lapangan, rekomendasi relasi bisnis, maupun observasi langsung terhadap kondisi pasar. Pendekatan tersebut seringkali menghasilkan informasi yang terbatas dan kurang efisien apabila diterapkan pada wilayah yang luas, sehingga dibutuhkan metode yang lebih objektif dan berbasis data dalam proses identifikasi calon mitra usaha.</w:t>
+        <w:t xml:space="preserve">Pertanyaannya kemudian, bagaimana rating dan jumlah ulasan tersebut bisa dibaca sebagai sinyal potensi bisnis? Filieri dkk. (2021) menemukan bahwa ulasan daring berkorelasi cukup kuat dengan persepsi kualitas dan tingkat kepercayaan konsumen terhadap suatu usaha. Artinya, toko dengan ulasan banyak dan rating tinggi kemungkinan besar memang ramai dikunjungi, bukan semata kebetulan. Indikator semacam ini, meski tidak sempurna, cukup memadai sebagai titik awal untuk menyaring ratusan toko buah menjadi beberapa kelompok berdasarkan tingkat aktivitasnya. Di sinilah data mining, khususnya teknik clustering, berperan: mengelompokkan objek-objek yang karakteristiknya serupa tanpa perlu label yang ditentukan terlebih dahulu (Han dkk., 2022).</w:t>
       </w:r>
     </w:p>
     <w:p>
@@ -1775,7 +1775,7 @@
           <w:sz w:val="24"/>
           <w:szCs w:val="24"/>
         </w:rPr>
-        <w:t xml:space="preserve">Rating dan jumlah ulasan pada Google Maps dapat digunakan sebagai indikator awal untuk memahami tingkat popularitas dan aktivitas suatu usaha. Penelitian Filieri et al. (2021) menunjukkan bahwa ulasan daring (online reviews) memiliki hubungan yang signifikan terhadap persepsi kualitas dan kepercayaan konsumen terhadap suatu usaha. Dari perspektif Sistem Informasi, pengolahan data digital dalam jumlah besar dapat dilakukan melalui pendekatan data mining, khususnya teknik clustering, yang memungkinkan objek dengan karakteristik serupa dikelompokkan ke dalam satu kelompok tertentu (Han et al., 2022).</w:t>
+        <w:t xml:space="preserve">Penerapan clustering pada data lokasi usaha bukan hal baru. Wikarta dan Defiyanti (2024) memperlihatkan bahwa algoritma K-Means cukup andal mengelompokkan UMKM berdasarkan karakteristik usaha dan letak geografisnya. Pratama dkk. (2023) pun membuktikan kombinasi analisis spasial dengan clustering mampu menghasilkan informasi yang berguna untuk keputusan distribusi komoditas pertanian. Hanya saja, kedua penelitian itu, dan sebagian besar penelitian sejenis, masih membahas UMKM secara umum atau komoditas pertanian secara luas. Belum ada yang secara spesifik menyasar toko buah sebagai target mitra bagi supplier. Ada juga sisi lain yang belum banyak disentuh: integrasi langsung antara teknik web scraping Google Maps dengan proses clustering dalam satu sistem yang bisa dipakai berulang, bukan sekadar analisis data sekali jalan menggunakan spreadsheet.</w:t>
       </w:r>
     </w:p>
     <w:p>
@@ -1790,22 +1790,7 @@
           <w:sz w:val="24"/>
           <w:szCs w:val="24"/>
         </w:rPr>
-        <w:t xml:space="preserve">Penelitian oleh Wikarta dan Defiyanti (2024) menunjukkan bahwa algoritma K-Means mampu mengelompokkan UMKM berdasarkan karakteristik usaha dan persebaran wilayah secara efektif, sedangkan penelitian Pratama et al. (2023) membuktikan bahwa kombinasi analisis spasial dan clustering dapat menghasilkan informasi yang bermanfaat dalam mendukung pengambilan keputusan distribusi komoditas. Meskipun demikian, penelitian-penelitian tersebut masih berfokus pada UMKM secara umum atau komoditas pertanian secara luas, sehingga belum secara spesifik membahas toko buah sebagai target potensial dalam jaringan distribusi supplier. Kesenjangan ini meliputi context gap (kajian toko buah sebagai calon mitra supplier masih terbatas), method gap (integrasi web scraping Google Maps dengan clustering dalam satu kerangka analisis masih jarang dilakukan), dan measurement gap (pemanfaatan rating dan jumlah ulasan sebagai indikator potensi mitra distribusi masih belum banyak dieksplorasi).</w:t>
-      </w:r>
-    </w:p>
-    <w:p>
-      <w:pPr>
-        <w:spacing w:after="0" w:line="360" w:lineRule="auto"/>
-        <w:ind w:firstLine="720"/>
-        <w:jc w:val="both"/>
-      </w:pPr>
-      <w:r>
-        <w:rPr>
-          <w:rFonts w:ascii="Times New Roman" w:cs="Times New Roman" w:eastAsia="Times New Roman" w:hAnsi="Times New Roman"/>
-          <w:sz w:val="24"/>
-          <w:szCs w:val="24"/>
-        </w:rPr>
-        <w:t xml:space="preserve">Berdasarkan uraian tersebut, penelitian mengenai analisis dan pengelompokan toko buah di Kabupaten Lumajang berdasarkan data Google Maps menjadi penting untuk dilakukan. Penelitian ini mengintegrasikan teknik web scraping, analisis spasial, dan algoritma K-Means dalam satu sistem berbasis web yang dibangun menggunakan framework Laravel, sehingga menghasilkan pemetaan dan segmentasi toko buah berdasarkan tingkat potensi kemitraan yang dapat membantu supplier menentukan prioritas wilayah distribusi secara lebih objektif dan berbasis data.</w:t>
+        <w:t xml:space="preserve">Bertolak dari kekosongan itu, penelitian ini disusun untuk membangun sekaligus menguji sebuah pendekatan: mengumpulkan data toko buah di Kabupaten Lumajang langsung dari Google Maps melalui web scraping, kemudian mengelompokkannya dengan algoritma K-Means berdasarkan rating, jumlah ulasan, dan lokasi. Berbeda dari pendekatan manual yang lazim dipakai supplier, hasil pengelompokan ini diharapkan memberi gambaran yang lebih objektif tentang toko mana yang pantas diprioritaskan sebagai mitra distribusi, dan mana yang masih perlu pengamatan lebih jauh.</w:t>
       </w:r>
     </w:p>
     <w:p>
@@ -1838,7 +1823,7 @@
           <w:sz w:val="24"/>
           <w:szCs w:val="24"/>
         </w:rPr>
-        <w:t xml:space="preserve">Berdasarkan latar belakang yang telah diuraikan, maka rumusan masalah dalam penelitian ini adalah sebagai berikut:</w:t>
+        <w:t xml:space="preserve">Dari uraian di atas, penelitian ini berupaya menjawab dua pertanyaan berikut:</w:t>
       </w:r>
     </w:p>
     <w:p>
@@ -1923,7 +1908,7 @@
           <w:sz w:val="24"/>
           <w:szCs w:val="24"/>
         </w:rPr>
-        <w:t xml:space="preserve">Untuk menjaga fokus penelitian dan menghindari pembahasan yang terlalu luas, penelitian ini dibatasi pada beberapa aspek berikut:</w:t>
+        <w:t xml:space="preserve">Agar pembahasan tidak melebar, beberapa batasan diterapkan pada penelitian ini:</w:t>
       </w:r>
     </w:p>
     <w:p>
@@ -1949,7 +1934,7 @@
           <w:sz w:val="24"/>
           <w:szCs w:val="24"/>
         </w:rPr>
-        <w:t xml:space="preserve">Objek penelitian terbatas pada toko buah, agen buah, dan pusat buah yang terdaftar pada Google Maps dalam wilayah administratif Kabupaten Lumajang.</w:t>
+        <w:t xml:space="preserve">Objek penelitian hanya toko buah, agen buah, dan pusat buah yang terdaftar di Google Maps dalam wilayah administratif Kabupaten Lumajang.</w:t>
       </w:r>
     </w:p>
     <w:p>
@@ -1975,7 +1960,7 @@
           <w:sz w:val="24"/>
           <w:szCs w:val="24"/>
         </w:rPr>
-        <w:t xml:space="preserve">Data penelitian diperoleh melalui teknik web scraping dari Google Maps menggunakan aplikasi scraper berbasis Node.js dan Playwright yang dibangun khusus untuk penelitian ini.</w:t>
+        <w:t xml:space="preserve">Data diambil melalui web scraping menggunakan aplikasi scraper berbasis Node.js dan Playwright yang dibangun khusus untuk keperluan penelitian ini.</w:t>
       </w:r>
     </w:p>
     <w:p>
@@ -2001,7 +1986,7 @@
           <w:sz w:val="24"/>
           <w:szCs w:val="24"/>
         </w:rPr>
-        <w:t xml:space="preserve">Variabel yang digunakan dalam proses clustering meliputi rating, jumlah ulasan (review count), latitude, dan longitude.</w:t>
+        <w:t xml:space="preserve">Variabel yang dipakai pada proses clustering terbatas pada rating, jumlah ulasan (review count), latitude, dan longitude.</w:t>
       </w:r>
     </w:p>
     <w:p>
@@ -2027,7 +2012,7 @@
           <w:sz w:val="24"/>
           <w:szCs w:val="24"/>
         </w:rPr>
-        <w:t xml:space="preserve">Metode yang digunakan untuk pengelompokan data adalah algoritma K-Means Clustering dengan k = 3, divalidasi menggunakan Elbow Method dan Silhouette Score.</w:t>
+        <w:t xml:space="preserve">Pengelompokan data menggunakan algoritma K-Means dengan k = 3, yang validitasnya diperiksa lewat Elbow Method dan Silhouette Score.</w:t>
       </w:r>
     </w:p>
     <w:p>
@@ -2053,7 +2038,7 @@
           <w:sz w:val="24"/>
           <w:szCs w:val="24"/>
         </w:rPr>
-        <w:t xml:space="preserve">Penelitian tidak membahas aspek keuangan usaha, volume penjualan, maupun rantai pasok secara menyeluruh karena data tersebut tidak tersedia pada Google Maps.</w:t>
+        <w:t xml:space="preserve">Aspek keuangan usaha, volume penjualan, dan rantai pasok secara menyeluruh tidak dibahas karena memang tidak tersedia datanya di Google Maps.</w:t>
       </w:r>
     </w:p>
     <w:p>
@@ -2079,7 +2064,7 @@
           <w:sz w:val="24"/>
           <w:szCs w:val="24"/>
         </w:rPr>
-        <w:t xml:space="preserve">Hasil penelitian menggambarkan kondisi data pada saat proses scraping dilakukan (snapshot data).</w:t>
+        <w:t xml:space="preserve">Hasil penelitian hanya mencerminkan kondisi data pada saat proses scraping berlangsung (snapshot data), bukan kondisi yang terus diperbarui.</w:t>
       </w:r>
     </w:p>
     <w:p>
@@ -2112,7 +2097,7 @@
           <w:sz w:val="24"/>
           <w:szCs w:val="24"/>
         </w:rPr>
-        <w:t xml:space="preserve">Berdasarkan rumusan masalah yang telah ditetapkan, tujuan penelitian ini adalah sebagai berikut:</w:t>
+        <w:t xml:space="preserve">Sejalan dengan rumusan masalah, penelitian ini bertujuan untuk:</w:t>
       </w:r>
     </w:p>
     <w:p>
@@ -2138,7 +2123,7 @@
           <w:sz w:val="24"/>
           <w:szCs w:val="24"/>
         </w:rPr>
-        <w:t xml:space="preserve">Menganalisis karakteristik dan pola persebaran spasial toko buah di Kabupaten Lumajang berdasarkan data yang diperoleh melalui teknik web scraping dari Google Maps.</w:t>
+        <w:t xml:space="preserve">menganalisis karakteristik dan pola persebaran spasial toko buah di Kabupaten Lumajang berdasarkan data yang dihimpun melalui web scraping dari Google Maps;</w:t>
       </w:r>
     </w:p>
     <w:p>
@@ -2164,7 +2149,7 @@
           <w:sz w:val="24"/>
           <w:szCs w:val="24"/>
         </w:rPr>
-        <w:t xml:space="preserve">Mengelompokkan toko buah menggunakan metode K-Means berdasarkan variabel rating, jumlah ulasan, dan lokasi usaha untuk mengidentifikasi kelompok toko buah yang memiliki potensi tinggi, sedang, dan rendah sebagai mitra supplier.</w:t>
+        <w:t xml:space="preserve">mengelompokkan toko buah dengan metode K-Means berdasarkan rating, jumlah ulasan, dan lokasi usaha, untuk memetakan toko buah ke dalam kategori potensi tinggi, sedang, dan rendah sebagai mitra supplier.</w:t>
       </w:r>
     </w:p>
     <w:p>
@@ -2215,7 +2200,7 @@
           <w:sz w:val="24"/>
           <w:szCs w:val="24"/>
         </w:rPr>
-        <w:t xml:space="preserve">Penelitian ini diharapkan dapat memberikan kontribusi terhadap pengembangan ilmu pengetahuan di bidang Sistem Informasi, khususnya pada kajian data mining, business intelligence, dan analisis spasial, serta memperkaya referensi mengenai penerapan teknik web scraping dan clustering dalam pemanfaatan data digital berbasis lokasi untuk mendukung pengambilan keputusan bisnis.</w:t>
+        <w:t xml:space="preserve">Secara akademik, penelitian ini diharapkan menambah referensi pada kajian data mining, business intelligence, dan analisis spasial di lingkup Sistem Informasi, khususnya yang berkaitan dengan pemanfaatan web scraping dan clustering atas data digital berbasis lokasi untuk mendukung keputusan bisnis.</w:t>
       </w:r>
     </w:p>
     <w:p>
@@ -2259,7 +2244,7 @@
           <w:sz w:val="24"/>
           <w:szCs w:val="24"/>
         </w:rPr>
-        <w:t xml:space="preserve">Bagi Supplier — memberikan informasi mengenai persebaran dan pengelompokan toko buah berdasarkan tingkat potensi usaha sehingga dapat membantu menentukan target mitra distribusi secara lebih efektif dan berbasis data.</w:t>
+        <w:t xml:space="preserve">Bagi supplier, hasil pengelompokan ini bisa dijadikan acuan awal dalam menentukan target mitra distribusi tanpa harus mensurvei seluruh wilayah satu per satu.</w:t>
       </w:r>
     </w:p>
     <w:p>
@@ -2285,7 +2270,7 @@
           <w:sz w:val="24"/>
           <w:szCs w:val="24"/>
         </w:rPr>
-        <w:t xml:space="preserve">Bagi Pemerintah Daerah — menjadi sumber informasi pendukung dalam perencanaan dan pengembangan sektor perdagangan hortikultura serta pemerataan distribusi komoditas pertanian di Kabupaten Lumajang.</w:t>
+        <w:t xml:space="preserve">Bagi pemerintah daerah, data dan peta persebaran toko buah dapat menjadi bahan pertimbangan dalam merencanakan pengembangan sektor perdagangan hortikultura di Kabupaten Lumajang.</w:t>
       </w:r>
     </w:p>
     <w:p>
@@ -2311,7 +2296,7 @@
           <w:sz w:val="24"/>
           <w:szCs w:val="24"/>
         </w:rPr>
-        <w:t xml:space="preserve">Bagi Akademisi — menjadi referensi bagi penelitian selanjutnya yang berkaitan dengan web scraping, data mining, clustering, dan pemanfaatan data Google Maps sebagai sumber data penelitian.</w:t>
+        <w:t xml:space="preserve">Bagi akademisi, penelitian ini bisa menjadi rujukan bagi kajian lanjutan seputar web scraping, data mining, clustering, maupun pemanfaatan data Google Maps sebagai sumber data penelitian.</w:t>
       </w:r>
     </w:p>
     <w:p>
@@ -2337,7 +2322,7 @@
           <w:sz w:val="24"/>
           <w:szCs w:val="24"/>
         </w:rPr>
-        <w:t xml:space="preserve">Bagi Program Studi Sistem Informasi — menjadi contoh implementasi penerapan metode data mining dan analisis spasial dalam menyelesaikan permasalahan bisnis berbasis data digital.</w:t>
+        <w:t xml:space="preserve">Bagi Program Studi Sistem Informasi, penelitian ini menjadi salah satu contoh penerapan data mining dan analisis spasial untuk menjawab persoalan bisnis nyata berbasis data digital.</w:t>
       </w:r>
     </w:p>
     <w:p>
@@ -2415,7 +2400,7 @@
           <w:sz w:val="24"/>
           <w:szCs w:val="24"/>
         </w:rPr>
-        <w:t xml:space="preserve">Toko buah merupakan salah satu pelaku usaha yang berperan dalam saluran distribusi komoditas hortikultura. Dalam rantai pasok agribisnis, toko buah berfungsi sebagai perantara antara supplier atau distributor dengan konsumen akhir, sehingga keberadaannya turut mempengaruhi kelancaran aliran barang dari produsen hingga ke pasar. Menurut Aprilyani et al. (2022), keterbatasan informasi mengenai calon mitra distribusi pada sektor agribisnis menjadi salah satu hambatan utama dalam efisiensi rantai pasok komoditas hortikultura di Indonesia, sehingga dibutuhkan pendekatan berbasis data yang mampu mengidentifikasi potensi mitra secara lebih sistematis dan terukur.</w:t>
+        <w:t xml:space="preserve">Dalam rantai pasok agribisnis, toko buah menempati posisi perantara: ia menerima pasokan dari supplier atau distributor, lalu menjualnya kepada konsumen akhir. Posisi ini membuat keberadaan toko buah ikut menentukan seberapa lancar arus barang dari produsen sampai ke pasar. Aprilyani dkk. (2022) mencatat bahwa salah satu kendala utama efisiensi rantai pasok hortikultura di Indonesia justru bukan pada produksi, melainkan pada keterbatasan informasi mengenai siapa saja calon mitra distribusi yang layak didekati.</w:t>
       </w:r>
     </w:p>
     <w:p>
@@ -2430,7 +2415,7 @@
           <w:sz w:val="24"/>
           <w:szCs w:val="24"/>
         </w:rPr>
-        <w:t xml:space="preserve">Potensi suatu toko buah sebagai mitra supplier dapat diidentifikasi melalui indikator digital berupa rating dan jumlah ulasan pelanggan pada platform daring seperti Google Maps. Semakin tinggi rating dan jumlah ulasan yang dimiliki, semakin besar kemungkinan usaha tersebut memiliki aktivitas bisnis yang relatif tinggi dibandingkan usaha lainnya. Dalam penelitian ini, toko buah dipandang sebagai objek bisnis yang dianalisis berdasarkan atribut digital dan lokasi geografis untuk mengidentifikasi potensi kemitraan dalam jaringan distribusi produk hortikultura.</w:t>
+        <w:t xml:space="preserve">Karena keterbatasan itulah indikator digital menjadi alternatif yang masuk akal. Rating dan jumlah ulasan di Google Maps bisa dibaca sebagai proksi atas tingkat aktivitas sebuah toko: semakin banyak ulasan dan semakin tinggi ratingnya, semakin besar kemungkinan toko tersebut memang ramai. Dalam kerangka penelitian ini, toko buah diperlakukan sebagai objek yang dianalisis lewat dua sisi sekaligus, atribut digital dan posisi geografisnya, untuk menebak potensinya sebagai mitra dalam jaringan distribusi hortikultura.</w:t>
       </w:r>
     </w:p>
     <w:p>
@@ -2463,7 +2448,7 @@
           <w:sz w:val="24"/>
           <w:szCs w:val="24"/>
         </w:rPr>
-        <w:t xml:space="preserve">Google Maps merupakan layanan pemetaan digital yang menyediakan berbagai informasi geografis dan bisnis berbasis lokasi, seperti nama usaha, alamat, koordinat geografis, rating, dan jumlah ulasan. Menurut Sharda et al. (2024), perkembangan teknologi business intelligence memungkinkan organisasi memanfaatkan sumber data eksternal seperti ini untuk menghasilkan informasi yang mendukung pengambilan keputusan. Data spasial (memiliki referensi geografis) dan data non-spasial (atribut karakteristik usaha) yang tersedia pada Google Maps memungkinkan dilakukannya analisis yang lebih komprehensif terhadap suatu fenomena bisnis (Longley et al., 2021).</w:t>
+        <w:t xml:space="preserve">Google Maps pada dasarnya adalah layanan pemetaan, tetapi seiring waktu ia menyimpan jauh lebih banyak informasi dari sekadar arah jalan. Nama usaha, alamat, koordinat, rating, jumlah ulasan, semuanya tercatat dan bisa diakses publik. Sharda dkk. (2024) menyebut kemajuan business intelligence memungkinkan organisasi memanfaatkan sumber data eksternal semacam ini untuk pengambilan keputusan. Longley dkk. (2021) membedakan dua jenis data yang relevan di sini: data spasial (memiliki referensi geografis) dan data non-spasial (atribut yang menjelaskan karakteristik objek). Kombinasi keduanya, sebagaimana tersedia di Google Maps, memungkinkan analisis yang lebih utuh terhadap fenomena bisnis dibandingkan jika hanya mengandalkan salah satunya.</w:t>
       </w:r>
     </w:p>
     <w:p>
@@ -2496,7 +2481,7 @@
           <w:sz w:val="24"/>
           <w:szCs w:val="24"/>
         </w:rPr>
-        <w:t xml:space="preserve">Web scraping merupakan teknik untuk mengekstraksi data dari halaman web secara otomatis menggunakan perangkat lunak tertentu. Mitchell (2024) menjelaskan bahwa web scraping merupakan proses pengambilan informasi dari situs web dengan membaca struktur halaman dan mengekstraksi elemen data yang dibutuhkan, sehingga data yang diperoleh dapat disimpan dalam format terstruktur untuk dianalisis lebih lanjut. Sirisuriya (2021) menambahkan bahwa teknik web scraping modern umumnya memanfaatkan automasi browser untuk menangani halaman web yang bersifat dinamis (rendering berbasis JavaScript), sebagaimana yang diterapkan pada Google Maps.</w:t>
+        <w:t xml:space="preserve">Mitchell (2024) mendefinisikan web scraping sebagai proses pengambilan informasi dari situs web dengan membaca struktur halamannya, lalu mengekstraksi elemen data yang dibutuhkan ke dalam format yang lebih terstruktur. Hal yang perlu digarisbawahi, menurut Sirisuriya (2021), adalah bahwa teknik scraping pada halaman web modern, yang banyak dirender lewat JavaScript seperti Google Maps, umumnya tidak bisa lagi mengandalkan pembacaan HTML statis saja. Diperlukan automasi browser yang benar-benar menjalankan halaman tersebut layaknya pengguna biasa, baru kemudian elemen-elemen di dalamnya bisa dibaca dan diambil.</w:t>
       </w:r>
     </w:p>
     <w:p>
@@ -2511,7 +2496,7 @@
           <w:sz w:val="24"/>
           <w:szCs w:val="24"/>
         </w:rPr>
-        <w:t xml:space="preserve">Pada penelitian ini, web scraping diimplementasikan menggunakan Node.js dengan library Playwright untuk mengotomasi browser Chromium, sehingga mampu membaca elemen hasil pencarian pada Google Maps dan mengekstraksi nama usaha, alamat, koordinat geografis, rating, dan jumlah ulasan toko buah di Kabupaten Lumajang.</w:t>
+        <w:t xml:space="preserve">Penelitian ini mengikuti pendekatan tersebut: scraping dijalankan menggunakan Node.js dengan library Playwright yang mengotomasi browser Chromium. Lewat cara ini, sistem dapat membuka Google Maps, melakukan pencarian sesuai kata kunci, lalu mengekstraksi nama usaha, alamat, koordinat, rating, dan jumlah ulasan dari setiap toko buah di Kabupaten Lumajang yang muncul pada hasil pencarian.</w:t>
       </w:r>
     </w:p>
     <w:p>
@@ -2544,7 +2529,7 @@
           <w:sz w:val="24"/>
           <w:szCs w:val="24"/>
         </w:rPr>
-        <w:t xml:space="preserve">Data mining merupakan proses penggalian pola atau informasi tersembunyi dari kumpulan data berukuran besar menggunakan teknik statistik, matematika, dan kecerdasan buatan. Menurut Han et al. (2022), data mining bertujuan menemukan pengetahuan baru yang dapat digunakan sebagai dasar pengambilan keputusan secara lebih efektif dan efisien. Pada penelitian ini, data mining digunakan untuk menganalisis karakteristik toko buah berdasarkan data Google Maps guna menghasilkan informasi yang mendukung identifikasi potensi mitra supplier.</w:t>
+        <w:t xml:space="preserve">Han dkk. (2022) menjelaskan data mining sebagai proses menggali pola atau informasi yang tersembunyi dari kumpulan data besar, memanfaatkan teknik statistik, matematika, dan kecerdasan buatan. Tujuannya bukan sekadar mengolah data, melainkan menemukan pengetahuan baru yang bisa dipakai sebagai dasar pengambilan keputusan. Pada penelitian ini, data mining dipakai untuk membaca karakteristik toko buah dari data Google Maps, lalu menerjemahkannya menjadi informasi yang berguna bagi identifikasi mitra supplier.</w:t>
       </w:r>
     </w:p>
     <w:p>
@@ -2577,7 +2562,7 @@
           <w:sz w:val="24"/>
           <w:szCs w:val="24"/>
         </w:rPr>
-        <w:t xml:space="preserve">Clustering merupakan salah satu teknik data mining yang bertujuan mengelompokkan objek berdasarkan tingkat kemiripan karakteristik yang dimiliki, dan termasuk ke dalam metode unsupervised learning karena dilakukan tanpa label yang telah ditentukan sebelumnya. Menurut Han et al. (2022), clustering berupaya menempatkan objek yang memiliki karakteristik serupa ke dalam satu cluster, sedangkan objek yang berbeda ditempatkan pada cluster yang berbeda. Secara umum, metode clustering dibagi menjadi clustering hierarki dan non-hierarki. Penelitian ini menggunakan pendekatan non-hierarki karena mampu mengelompokkan data dalam jumlah besar dengan proses komputasi yang relatif sederhana dan efisien.</w:t>
+        <w:t xml:space="preserve">Clustering termasuk salah satu cabang data mining yang masuk kategori unsupervised learning, karena pengelompokan dilakukan tanpa label yang sudah ditentukan sebelumnya. Han dkk. (2022) menjelaskan logika dasarnya: objek dengan karakteristik mirip ditempatkan pada cluster yang sama, sedangkan objek yang berbeda dipisahkan ke cluster lain. Ada dua pendekatan besar dalam clustering, yaitu hierarki dan non-hierarki. Penelitian ini memilih pendekatan non-hierarki, terutama karena lebih ringan secara komputasi ketika data yang diproses berjumlah cukup banyak.</w:t>
       </w:r>
     </w:p>
     <w:p>
@@ -2610,7 +2595,7 @@
           <w:sz w:val="24"/>
           <w:szCs w:val="24"/>
         </w:rPr>
-        <w:t xml:space="preserve">K-Means merupakan algoritma clustering non-hierarki yang paling banyak digunakan untuk mengelompokkan data berdasarkan tingkat kemiripan karakteristik. Algoritma ini bekerja dengan membagi data ke dalam sejumlah cluster yang telah ditentukan melalui proses iteratif (Lloyd’s algorithm) hingga diperoleh pusat cluster (centroid) yang stabil. Proses dimulai dengan menentukan jumlah cluster (k), memilih centroid awal, menghitung jarak setiap data terhadap centroid, menempatkan data pada cluster terdekat, lalu menghitung ulang centroid berdasarkan rata-rata anggota cluster, dan mengulangi proses tersebut hingga konvergen.</w:t>
+        <w:t xml:space="preserve">K-Means adalah salah satu algoritma clustering non-hierarki yang paling sering dipakai. Cara kerjanya berputar pada proses iteratif: tentukan jumlah cluster (k), pilih centroid awal, hitung jarak setiap data ke masing-masing centroid, lalu tempatkan data pada cluster dengan centroid terdekat. Setelah semua data terkelompok, centroid dihitung ulang berdasarkan rata-rata anggotanya, dan proses diulang sampai tidak ada lagi perubahan keanggotaan cluster. Kondisi semacam ini dikenal sebagai konvergensi pada algoritma Lloyd.</w:t>
       </w:r>
     </w:p>
     <w:p>
@@ -2625,7 +2610,7 @@
           <w:sz w:val="24"/>
           <w:szCs w:val="24"/>
         </w:rPr>
-        <w:t xml:space="preserve">Pada penelitian ini, jumlah cluster ditetapkan sebanyak tiga (k = 3) yang mewakili kategori potensi tinggi, sedang, dan rendah sebagai calon mitra supplier, dengan variabel rating, jumlah ulasan, latitude, dan longitude. Perhitungan jarak menggunakan metode Euclidean Distance:</w:t>
+        <w:t xml:space="preserve">Pada penelitian ini, k ditetapkan sebanyak tiga, mewakili tiga kategori potensi: tinggi, sedang, dan rendah. Variabel yang dipakai ada empat, yaitu rating, jumlah ulasan, latitude, dan longitude, dengan jarak antar-data dihitung memakai Euclidean Distance:</w:t>
       </w:r>
     </w:p>
     <w:p>
@@ -2699,7 +2684,7 @@
           <w:sz w:val="24"/>
           <w:szCs w:val="24"/>
         </w:rPr>
-        <w:t xml:space="preserve">dengan d(x,y) adalah jarak antara dua titik data, xi dan yi adalah nilai atribut pada objek pertama dan kedua, serta n adalah jumlah atribut yang digunakan. Algoritma K-Means dipilih karena memiliki kemampuan baik dalam mengelompokkan data numerik, mudah diimplementasikan, serta menghasilkan segmentasi yang dapat diinterpretasikan secara langsung untuk mendukung pengambilan keputusan bisnis.</w:t>
+        <w:t xml:space="preserve">di mana d(x,y) merupakan jarak antara dua titik data, xi dan yi masing-masing nilai atribut pada objek pertama dan kedua, dan n adalah banyaknya atribut yang diperhitungkan. Alasan pemilihan K-Means cukup sederhana: algoritma ini relatif mudah diimplementasikan, cocok untuk data numerik, dan hasilnya bisa langsung diterjemahkan menjadi rekomendasi bisnis tanpa perlu interpretasi yang rumit.</w:t>
       </w:r>
     </w:p>
     <w:p>
@@ -2732,7 +2717,7 @@
           <w:sz w:val="24"/>
           <w:szCs w:val="24"/>
         </w:rPr>
-        <w:t xml:space="preserve">Evaluasi model clustering dilakukan untuk mengukur kualitas pengelompokan dan memvalidasi pemilihan nilai k. Ezugwu et al. (2022) menjelaskan dua metode evaluasi yang umum digunakan. Pertama, Elbow Method digunakan untuk menentukan nilai k optimal dengan memplot nilai WCSS (Within-Cluster Sum of Squares) terhadap berbagai nilai k, kemudian memilih titik siku (elbow point) pada grafik sebagai nilai k terbaik — titik di mana penurunan WCSS mulai melandai secara signifikan. Kedua, Silhouette Score digunakan untuk mengukur seberapa baik setiap objek berada dalam cluster-nya sendiri dibandingkan dengan cluster terdekat lainnya, dengan nilai berkisar antara −1 hingga 1; nilai yang mendekati 1 menandakan kualitas clustering yang baik.</w:t>
+        <w:t xml:space="preserve">Menentukan k = 3 saja tidak cukup tanpa ada cara untuk memeriksa apakah pilihan tersebut memang masuk akal. Ezugwu dkk. (2022) menjabarkan dua metode evaluasi yang lazim dipakai untuk keperluan ini. Elbow Method bekerja dengan memplot nilai WCSS (Within-Cluster Sum of Squares) untuk berbagai nilai k, lalu mencari titik di mana penurunan grafiknya mulai melandai, yang biasa disebut titik siku. Silhouette Score, di sisi lain, mengukur seberapa "betah" setiap objek berada di cluster-nya dibanding cluster lain yang terdekat, dengan rentang nilai -1 sampai 1; semakin mendekati 1, semakin baik kualitas pengelompokannya.</w:t>
       </w:r>
     </w:p>
     <w:p>
@@ -2747,7 +2732,7 @@
           <w:sz w:val="24"/>
           <w:szCs w:val="24"/>
         </w:rPr>
-        <w:t xml:space="preserve">Pada penelitian ini, kedua metode evaluasi tersebut diimplementasikan langsung pada modul analisis K-Means aplikasi (KMeansService), sehingga nilai WCSS untuk k = 1 hingga k = 6 dan Silhouette Score untuk k = 3 dapat dihitung secara otomatis setiap kali analisis dijalankan, dan hasilnya ditampilkan pada halaman Analisis K-Means.</w:t>
+        <w:t xml:space="preserve">Kedua metode evaluasi tersebut tidak hanya dibahas secara teori pada penelitian ini, tetapi juga ditanamkan langsung ke dalam kode aplikasi lewat kelas KMeansService. Setiap kali analisis dijalankan, sistem otomatis menghitung WCSS untuk k = 1 sampai k = 6 dan Silhouette Score untuk k = 3, kemudian menampilkan keduanya pada halaman Analisis K-Means tanpa perlu dihitung manual di luar sistem.</w:t>
       </w:r>
     </w:p>
     <w:p>
@@ -2780,7 +2765,7 @@
           <w:sz w:val="24"/>
           <w:szCs w:val="24"/>
         </w:rPr>
-        <w:t xml:space="preserve">Penelitian ini bersifat deskriptif dan eksploratif sehingga tidak dirancang untuk menguji hipotesis tertentu, melainkan untuk membangun kerangka konseptual yang menggambarkan alur penelitian secara menyeluruh. Penelitian diawali dengan identifikasi masalah, yaitu kesulitan supplier dalam menemukan calon mitra toko buah yang potensial di Kabupaten Lumajang. Selanjutnya dilakukan pengumpulan data toko buah melalui teknik web scraping pada platform Google Maps, meliputi nama usaha, koordinat geografis, rating, dan jumlah ulasan pengguna.</w:t>
+        <w:t xml:space="preserve">Karena sifatnya deskriptif dan eksploratif, penelitian ini tidak menyusun hipotesis yang akan diuji secara statistik. Yang dibangun justru kerangka konseptual yang memetakan alur kerja dari awal sampai akhir. Semuanya berawal dari satu masalah konkret: supplier kesulitan menemukan toko buah yang layak dijadikan mitra di Kabupaten Lumajang. Dari titik itu, data dikumpulkan lewat web scraping Google Maps, mencakup nama usaha, koordinat, rating, dan jumlah ulasan, sebagai bahan baku analisis.</w:t>
       </w:r>
     </w:p>
     <w:p>
@@ -2795,7 +2780,7 @@
           <w:sz w:val="24"/>
           <w:szCs w:val="24"/>
         </w:rPr>
-        <w:t xml:space="preserve">Data yang diperoleh kemudian melalui tahap preprocessing untuk membersihkan dan menyiapkan data sebelum dianalisis, dilanjutkan dengan normalisasi Min-Max agar tidak terjadi dominasi variabel tertentu. Data yang telah dinormalisasi selanjutnya diproses menggunakan algoritma K-Means untuk menghasilkan pengelompokan toko buah berdasarkan karakteristik yang dimiliki, divalidasi dengan Elbow Method dan Silhouette Score. Hasil clustering menghasilkan tiga kelompok potensi usaha — tinggi, sedang, dan rendah — yang divisualisasikan pada peta interaktif sehingga dapat digunakan untuk mengidentifikasi wilayah yang berpotensi menjadi target prioritas bagi supplier dalam menjalin kemitraan distribusi komoditas hortikultura.</w:t>
+        <w:t xml:space="preserve">Data mentah tersebut kemudian dibersihkan pada tahap preprocessing, dinormalisasi dengan Min-Max agar tidak ada variabel yang mendominasi karena perbedaan satuan, lalu diproses dengan K-Means. Hasilnya divalidasi lewat Elbow Method dan Silhouette Score sebelum akhirnya divisualisasikan pada peta interaktif. Tiga kelompok potensi (tinggi, sedang, rendah) yang muncul dari proses ini menjadi dasar rekomendasi bagi supplier dalam menentukan wilayah dan toko mana yang perlu diprioritaskan terlebih dahulu.</w:t>
       </w:r>
     </w:p>
     <w:p>
@@ -2809,7 +2794,7 @@
           <w:sz w:val="22"/>
           <w:szCs w:val="22"/>
         </w:rPr>
-        <w:t xml:space="preserve">Gambar 2.1 Kerangka konseptual penelitian: Identifikasi Masalah → Web Scraping → Preprocessing → Normalisasi Min-Max → K-Means Clustering (k=3) → Evaluasi (Elbow &amp; Silhouette) → Visualisasi Peta → Rekomendasi Mitra Supplier</w:t>
+        <w:t xml:space="preserve">Gambar 2.1 Kerangka konseptual penelitian: identifikasi masalah, web scraping, preprocessing, normalisasi Min-Max, K-Means clustering (k=3), evaluasi (Elbow &amp; Silhouette), visualisasi peta, rekomendasi mitra supplier</w:t>
       </w:r>
     </w:p>
     <w:p>
@@ -2869,7 +2854,7 @@
           <w:sz w:val="24"/>
           <w:szCs w:val="24"/>
         </w:rPr>
-        <w:t xml:space="preserve">Penelitian dilaksanakan di wilayah Kabupaten Lumajang, Provinsi Jawa Timur. Pemilihan lokasi penelitian didasarkan pada potensi Kabupaten Lumajang sebagai salah satu daerah penghasil komoditas hortikultura yang membutuhkan distribusi hasil pertanian secara efektif dan efisien. Pengambilan data dilakukan melalui platform Google Maps pada periode penelitian tahun 2026 sesuai dengan ketersediaan data publik yang dapat diakses.</w:t>
+        <w:t xml:space="preserve">Penelitian ini berlokasi di Kabupaten Lumajang, Provinsi Jawa Timur. Lokasi ini dipilih karena daerah ini punya basis produksi hortikultura yang cukup besar namun pola distribusinya belum banyak dipetakan secara digital. Pengambilan data dilakukan lewat Google Maps pada periode penelitian tahun 2026, menyesuaikan ketersediaan data publik yang bisa diakses pada rentang waktu tersebut.</w:t>
       </w:r>
     </w:p>
     <w:p>
@@ -2902,7 +2887,7 @@
           <w:sz w:val="24"/>
           <w:szCs w:val="24"/>
         </w:rPr>
-        <w:t xml:space="preserve">Populasi penelitian adalah seluruh toko buah, agen buah, dan pusat buah yang terdaftar pada platform Google Maps di wilayah Kabupaten Lumajang yang teridentifikasi menggunakan kata kunci seperti "Toko Buah", "Agen Buah", "Pusat Buah", dan "Grosir Buah". Sampel penelitian adalah subset data yang berhasil dikumpulkan melalui proses web scraping dan memenuhi syarat kelengkapan data (memiliki nilai rating, jumlah ulasan, latitude, dan longitude yang lengkap) untuk diproses pada tahap clustering.</w:t>
+        <w:t xml:space="preserve">Populasinya adalah seluruh toko buah, agen buah, dan pusat buah yang tercatat di Google Maps wilayah Kabupaten Lumajang, yang ditemukan lewat kata kunci "Toko Buah", "Agen Buah", "Pusat Buah", dan "Grosir Buah". Dari populasi itu, sampel yang dipakai pada tahap clustering hanya data yang lolos syarat kelengkapan, yakni punya nilai rating, jumlah ulasan, latitude, dan longitude sekaligus, bukan sebagian saja.</w:t>
       </w:r>
     </w:p>
     <w:p>
@@ -2935,7 +2920,7 @@
           <w:sz w:val="24"/>
           <w:szCs w:val="24"/>
         </w:rPr>
-        <w:t xml:space="preserve">Penelitian ini merupakan penelitian kuantitatif dengan pendekatan deskriptif dan eksploratif yang memanfaatkan teknik data mining untuk menganalisis dan mengelompokkan toko buah di Kabupaten Lumajang. Pendekatan kuantitatif digunakan karena penelitian memanfaatkan data numerik berupa rating, jumlah ulasan, dan koordinat geografis yang dianalisis menggunakan algoritma clustering untuk menghasilkan informasi mengenai potensi mitra supplier pada wilayah penelitian.</w:t>
+        <w:t xml:space="preserve">Penelitian ini bersifat kuantitatif dengan pendekatan deskriptif-eksploratif. Pilihan ini diambil karena data yang diolah memang berbentuk numerik, yaitu rating, jumlah ulasan, dan koordinat, yang kemudian dianalisis dengan algoritma clustering untuk menghasilkan gambaran potensi mitra supplier di wilayah penelitian.</w:t>
       </w:r>
     </w:p>
     <w:p>
@@ -2968,7 +2953,7 @@
           <w:sz w:val="24"/>
           <w:szCs w:val="24"/>
         </w:rPr>
-        <w:t xml:space="preserve">Tahapan penelitian yang dilakukan adalah sebagai berikut:</w:t>
+        <w:t xml:space="preserve">Penelitian dijalankan melalui sembilan tahap berikut:</w:t>
       </w:r>
     </w:p>
     <w:p>
@@ -2994,7 +2979,7 @@
           <w:sz w:val="24"/>
           <w:szCs w:val="24"/>
         </w:rPr>
-        <w:t xml:space="preserve">Identifikasi masalah — mengidentifikasi permasalahan terkait kesulitan supplier dalam menemukan calon mitra toko buah yang potensial di Kabupaten Lumajang.</w:t>
+        <w:t xml:space="preserve">identifikasi masalah, yakni kesulitan supplier menemukan calon mitra toko buah di Kabupaten Lumajang;</w:t>
       </w:r>
     </w:p>
     <w:p>
@@ -3020,7 +3005,7 @@
           <w:sz w:val="24"/>
           <w:szCs w:val="24"/>
         </w:rPr>
-        <w:t xml:space="preserve">Pengembangan sistem — membangun aplikasi web berbasis Laravel yang dilengkapi modul scraper, penyimpanan data, dan analisis K-Means.</w:t>
+        <w:t xml:space="preserve">pengembangan sistem, membangun aplikasi web berbasis Laravel lengkap dengan modul scraper, penyimpanan data, dan analisis K-Means;</w:t>
       </w:r>
     </w:p>
     <w:p>
@@ -3046,7 +3031,7 @@
           <w:sz w:val="24"/>
           <w:szCs w:val="24"/>
         </w:rPr>
-        <w:t xml:space="preserve">Pengumpulan data — menjalankan scraper berbasis Playwright untuk mengumpulkan data toko buah dari Google Maps berdasarkan kata kunci yang telah ditentukan.</w:t>
+        <w:t xml:space="preserve">pengumpulan data, menjalankan scraper berbasis Playwright untuk menghimpun data toko buah dari Google Maps sesuai kata kunci yang ditentukan;</w:t>
       </w:r>
     </w:p>
     <w:p>
@@ -3072,7 +3057,7 @@
           <w:sz w:val="24"/>
           <w:szCs w:val="24"/>
         </w:rPr>
-        <w:t xml:space="preserve">Preprocessing data — menghapus data duplikat dan data yang tidak lengkap, serta memeriksa konsistensi data sebelum proses clustering.</w:t>
+        <w:t xml:space="preserve">preprocessing data, membuang data duplikat dan data yang tidak lengkap, sekaligus memeriksa konsistensinya;</w:t>
       </w:r>
     </w:p>
     <w:p>
@@ -3098,7 +3083,7 @@
           <w:sz w:val="24"/>
           <w:szCs w:val="24"/>
         </w:rPr>
-        <w:t xml:space="preserve">Normalisasi data — menerapkan Min-Max Normalization pada variabel rating, jumlah ulasan, latitude, dan longitude.</w:t>
+        <w:t xml:space="preserve">normalisasi data, menerapkan Min-Max Normalization pada rating, jumlah ulasan, latitude, dan longitude;</w:t>
       </w:r>
     </w:p>
     <w:p>
@@ -3124,7 +3109,7 @@
           <w:sz w:val="24"/>
           <w:szCs w:val="24"/>
         </w:rPr>
-        <w:t xml:space="preserve">Proses clustering — menjalankan algoritma K-Means dengan k = 3 (Potensi Tinggi, Sedang, Rendah) menggunakan Euclidean Distance.</w:t>
+        <w:t xml:space="preserve">proses clustering, menjalankan K-Means dengan k = 3 menggunakan Euclidean Distance;</w:t>
       </w:r>
     </w:p>
     <w:p>
@@ -3150,7 +3135,7 @@
           <w:sz w:val="24"/>
           <w:szCs w:val="24"/>
         </w:rPr>
-        <w:t xml:space="preserve">Evaluasi model — menghitung WCSS untuk Elbow Method (k = 1 s.d. 6) dan Silhouette Score untuk memvalidasi pemilihan k = 3.</w:t>
+        <w:t xml:space="preserve">evaluasi model, menghitung WCSS untuk Elbow Method (k = 1 sampai 6) dan Silhouette Score untuk memeriksa kelayakan k = 3;</w:t>
       </w:r>
     </w:p>
     <w:p>
@@ -3176,7 +3161,7 @@
           <w:sz w:val="24"/>
           <w:szCs w:val="24"/>
         </w:rPr>
-        <w:t xml:space="preserve">Analisis dan visualisasi hasil — menyajikan hasil clustering dalam tabel dan peta interaktif berbasis Leaflet.js.</w:t>
+        <w:t xml:space="preserve">analisis dan visualisasi hasil, menyajikan hasil clustering dalam tabel dan peta interaktif berbasis Leaflet.js;</w:t>
       </w:r>
     </w:p>
     <w:p>
@@ -3202,7 +3187,7 @@
           <w:sz w:val="24"/>
           <w:szCs w:val="24"/>
         </w:rPr>
-        <w:t xml:space="preserve">Penyusunan kesimpulan dan rekomendasi — menyusun rekomendasi wilayah dan toko buah yang berpotensi menjadi mitra supplier.</w:t>
+        <w:t xml:space="preserve">penyusunan kesimpulan dan rekomendasi, merangkum wilayah dan toko buah yang berpotensi menjadi mitra supplier.</w:t>
       </w:r>
     </w:p>
     <w:p>
@@ -3249,7 +3234,7 @@
           <w:sz w:val="24"/>
           <w:szCs w:val="24"/>
         </w:rPr>
-        <w:t xml:space="preserve">Penelitian menggunakan data primer yang diperoleh melalui proses web scraping pada platform Google Maps. Proses scraping dilakukan menggunakan aplikasi scraper yang dibangun dengan Node.js dan library Playwright (file gmaps-scraper.js), yang mengotomasi browser Chromium untuk membuka Google Maps, melakukan pencarian berdasarkan kata kunci dan area, men-scroll daftar hasil, lalu mengekstraksi nama usaha, alamat, koordinat geografis, rating, dan jumlah ulasan setiap tempat. Data yang berhasil diekstraksi dikirim ke aplikasi Laravel melalui API internal dan disimpan pada tabel places di basis data MySQL. Selain data primer, penelitian juga menggunakan data sekunder berupa jurnal ilmiah, buku, dan laporan statistik instansi pemerintah yang relevan dengan topik penelitian.</w:t>
+        <w:t xml:space="preserve">Data primer penelitian ini diperoleh lewat web scraping Google Maps menggunakan aplikasi scraper yang dibangun dengan Node.js dan Playwright (berkas gmaps-scraper.js). Aplikasi tersebut mengotomasi browser Chromium untuk membuka Google Maps, mencari berdasarkan kata kunci dan area, men-scroll daftar hasil pencarian, lalu mengekstraksi nama usaha, alamat, koordinat, rating, dan jumlah ulasan dari setiap tempat yang muncul. Hasil ekstraksi itu dikirim ke aplikasi Laravel melalui API internal dan disimpan ke tabel places pada basis data MySQL. Sebagai pelengkap, penelitian ini juga memakai data sekunder berupa jurnal, buku, dan laporan statistik instansi pemerintah yang relevan dengan topik yang dibahas.</w:t>
       </w:r>
     </w:p>
     <w:p>
@@ -3264,7 +3249,7 @@
           <w:sz w:val="24"/>
           <w:szCs w:val="24"/>
         </w:rPr>
-        <w:t xml:space="preserve">Variabel yang digunakan dalam proses clustering ditunjukkan pada Tabel 3.1.</w:t>
+        <w:t xml:space="preserve">Tabel 3.1 merinci variabel yang dipakai pada proses clustering.</w:t>
       </w:r>
     </w:p>
     <w:p>
@@ -3438,7 +3423,7 @@
                 <w:sz w:val="22"/>
                 <w:szCs w:val="22"/>
               </w:rPr>
-              <w:t xml:space="preserve">Tingkat penilaian pelanggan (skala 1–5)</w:t>
+              <w:t xml:space="preserve">Skor penilaian pelanggan, rentang 1 sampai 5</w:t>
             </w:r>
           </w:p>
         </w:tc>
@@ -3500,7 +3485,7 @@
                 <w:sz w:val="22"/>
                 <w:szCs w:val="22"/>
               </w:rPr>
-              <w:t xml:space="preserve">Banyaknya ulasan pelanggan (review count)</w:t>
+              <w:t xml:space="preserve">Banyaknya ulasan (review count) yang tercatat</w:t>
             </w:r>
           </w:p>
         </w:tc>
@@ -3562,7 +3547,7 @@
                 <w:sz w:val="22"/>
                 <w:szCs w:val="22"/>
               </w:rPr>
-              <w:t xml:space="preserve">Posisi geografis lintang</w:t>
+              <w:t xml:space="preserve">Koordinat lintang lokasi usaha</w:t>
             </w:r>
           </w:p>
         </w:tc>
@@ -3624,7 +3609,7 @@
                 <w:sz w:val="22"/>
                 <w:szCs w:val="22"/>
               </w:rPr>
-              <w:t xml:space="preserve">Posisi geografis bujur</w:t>
+              <w:t xml:space="preserve">Koordinat bujur lokasi usaha</w:t>
             </w:r>
           </w:p>
         </w:tc>
@@ -3660,7 +3645,7 @@
           <w:sz w:val="24"/>
           <w:szCs w:val="24"/>
         </w:rPr>
-        <w:t xml:space="preserve">Penelitian ini menggunakan beberapa instrumen perangkat lunak, yaitu: (1) Laravel 12 dan PHP 8.2 sebagai framework dan bahasa pemrograman backend aplikasi web; (2) MySQL sebagai sistem manajemen basis data; (3) Node.js dengan library Playwright sebagai mesin web scraping Google Maps; (4) Leaflet.js sebagai library visualisasi peta interaktif; serta (5) Vite dan Tailwind CSS untuk pengembangan antarmuka pengguna. Seluruh komponen tersebut diintegrasikan dalam satu aplikasi web bernama Mafaza Fortuna yang menangani proses scraping, penyimpanan data, analisis K-Means, hingga visualisasi hasil.</w:t>
+        <w:t xml:space="preserve">Ada lima instrumen perangkat lunak utama yang dipakai: Laravel 12 dan PHP 8.2 sebagai fondasi backend aplikasi; MySQL sebagai basis data; Node.js dengan Playwright sebagai mesin scraping Google Maps; Leaflet.js untuk visualisasi peta interaktif; serta Vite dan Tailwind CSS untuk antarmuka pengguna. Kelimanya menyatu dalam satu aplikasi bernama Mafaza Fortuna, yang menangani seluruh proses dari scraping, penyimpanan data, analisis K-Means, sampai penyajian hasilnya kepada pengguna.</w:t>
       </w:r>
     </w:p>
     <w:p>
@@ -3693,7 +3678,7 @@
           <w:sz w:val="24"/>
           <w:szCs w:val="24"/>
         </w:rPr>
-        <w:t xml:space="preserve">Teknik analisis data yang digunakan adalah analisis clustering menggunakan algoritma K-Means yang diimplementasikan pada kelas KMeansService di aplikasi. Langkah-langkah analisis yang dilakukan oleh sistem adalah sebagai berikut:</w:t>
+        <w:t xml:space="preserve">Analisis data pada penelitian ini dilakukan lewat algoritma K-Means yang ditanamkan pada kelas KMeansService di aplikasi. Urutan kerjanya sebagai berikut:</w:t>
       </w:r>
     </w:p>
     <w:p>
@@ -3719,7 +3704,7 @@
           <w:sz w:val="24"/>
           <w:szCs w:val="24"/>
         </w:rPr>
-        <w:t xml:space="preserve">Mengambil seluruh data toko buah yang memiliki nilai rating, jumlah ulasan, latitude, dan longitude lengkap, kemudian menghapus data duplikat berdasarkan kombinasi nama dan alamat.</w:t>
+        <w:t xml:space="preserve">mengambil seluruh data toko buah yang memiliki rating, jumlah ulasan, latitude, dan longitude secara lengkap, lalu membuang duplikat berdasarkan kombinasi nama dan alamat;</w:t>
       </w:r>
     </w:p>
     <w:p>
@@ -3745,7 +3730,7 @@
           <w:sz w:val="24"/>
           <w:szCs w:val="24"/>
         </w:rPr>
-        <w:t xml:space="preserve">Menerapkan Min-Max Normalization pada keempat variabel agar berada pada rentang skala yang sama (0 sampai 1), sehingga tidak ada variabel yang mendominasi proses clustering akibat perbedaan satuan.</w:t>
+        <w:t xml:space="preserve">menerapkan Min-Max Normalization pada keempat variabel itu agar skalanya sama-sama berada di rentang 0 sampai 1, supaya tidak ada satu variabel pun yang mendominasi proses clustering hanya karena rentang nilainya lebih besar;</w:t>
       </w:r>
     </w:p>
     <w:p>
@@ -3771,7 +3756,7 @@
           <w:sz w:val="24"/>
           <w:szCs w:val="24"/>
         </w:rPr>
-        <w:t xml:space="preserve">Menentukan k = 3 dan memilih centroid awal secara acak, kemudian menghitung jarak setiap data terhadap centroid menggunakan Euclidean Distance dan menetapkan setiap data ke cluster dengan jarak terdekat.</w:t>
+        <w:t xml:space="preserve">menentukan k = 3, memilih centroid awal secara acak, menghitung jarak setiap data ke tiap centroid memakai Euclidean Distance, lalu menetapkan data ke cluster dengan jarak terdekat;</w:t>
       </w:r>
     </w:p>
     <w:p>
@@ -3797,7 +3782,7 @@
           <w:sz w:val="24"/>
           <w:szCs w:val="24"/>
         </w:rPr>
-        <w:t xml:space="preserve">Menghitung ulang nilai centroid berdasarkan rata-rata anggota setiap cluster, lalu mengulangi langkah penetapan cluster hingga tidak ada perubahan anggota cluster (konvergen) atau mencapai maksimum 100 iterasi (algoritma Lloyd).</w:t>
+        <w:t xml:space="preserve">menghitung ulang centroid dari rata-rata anggota tiap cluster, dan mengulang langkah penetapan cluster sampai tidak ada perubahan keanggotaan atau sampai iterasi mencapai batas maksimum seratus kali;</w:t>
       </w:r>
     </w:p>
     <w:p>
@@ -3823,7 +3808,7 @@
           <w:sz w:val="24"/>
           <w:szCs w:val="24"/>
         </w:rPr>
-        <w:t xml:space="preserve">Memberi label "Tinggi", "Sedang", dan "Rendah" pada setiap cluster berdasarkan peringkat skor rata-rata rating ditambah logaritma jumlah ulasan pada setiap cluster, sebagai indikator potensi kemitraan bisnis.</w:t>
+        <w:t xml:space="preserve">memberi label "Tinggi", "Sedang", dan "Rendah" pada tiap cluster berdasarkan peringkat skor gabungan rata-rata rating dan logaritma jumlah ulasan, sebagai proksi tingkat potensi kemitraan;</w:t>
       </w:r>
     </w:p>
     <w:p>
@@ -3849,7 +3834,7 @@
           <w:sz w:val="24"/>
           <w:szCs w:val="24"/>
         </w:rPr>
-        <w:t xml:space="preserve">Menghitung WCSS untuk k = 1 sampai k = 6 (Elbow Method, dengan 5 kali pengulangan inisialisasi centroid acak per nilai k untuk menghindari hasil lokal yang buruk) serta menghitung Silhouette Score rata-rata untuk k = 3, sebagai validasi kualitas dan jumlah cluster yang dipilih.</w:t>
+        <w:t xml:space="preserve">menghitung WCSS untuk k = 1 sampai k = 6 guna keperluan Elbow Method, dengan lima kali pengulangan inisialisasi centroid acak per nilai k agar hasilnya tidak terjebak pada titik lokal yang kurang baik, serta menghitung Silhouette Score rata-rata untuk k = 3.</w:t>
       </w:r>
     </w:p>
     <w:p>
@@ -3864,7 +3849,7 @@
           <w:sz w:val="24"/>
           <w:szCs w:val="24"/>
         </w:rPr>
-        <w:t xml:space="preserve">Hasil clustering beserta evaluasi model disimpan pada basis data dan ditampilkan pada halaman Analisis K-Means aplikasi, yang mencakup ringkasan jumlah tempat per kategori potensi, rata-rata rating dan jumlah ulasan, grafik WCSS, nilai Silhouette Score, serta tabel hasil pengelompokan setiap toko buah.</w:t>
+        <w:t xml:space="preserve">Seluruh hasil clustering beserta angka-angka evaluasinya disimpan ke basis data dan ditampilkan pada halaman Analisis K-Means: mulai dari ringkasan jumlah tempat per kategori, rata-rata rating dan jumlah ulasan, grafik WCSS, nilai Silhouette Score, hingga tabel rincian per toko buah.</w:t>
       </w:r>
     </w:p>
     <w:p>
@@ -3897,7 +3882,7 @@
           <w:sz w:val="24"/>
           <w:szCs w:val="24"/>
         </w:rPr>
-        <w:t xml:space="preserve">Penelitian ini tidak melibatkan subjek manusia secara langsung maupun pengumpulan data pribadi yang bersifat sensitif. Data yang digunakan merupakan informasi bisnis yang tersedia secara publik pada platform Google Maps (nama usaha, alamat, rating, dan jumlah ulasan), sehingga penelitian ini tidak memerlukan persetujuan laik etik (ethical clearance) dari lembaga terkait.</w:t>
+        <w:t xml:space="preserve">Tidak ada subjek manusia yang dilibatkan secara langsung pada penelitian ini, juga tidak ada data pribadi sensitif yang dikumpulkan. Data yang diolah murni informasi bisnis yang memang terbuka untuk publik di Google Maps (nama usaha, alamat, rating, dan jumlah ulasan), sehingga persetujuan laik etik (ethical clearance) dari lembaga terkait tidak diperlukan.</w:t>
       </w:r>
     </w:p>
     <w:p>
@@ -3957,7 +3942,7 @@
           <w:sz w:val="24"/>
           <w:szCs w:val="24"/>
         </w:rPr>
-        <w:t xml:space="preserve">Proses pengumpulan data dilakukan melalui aplikasi scraper berbasis Node.js dan Playwright yang dijalankan terhadap Google Maps menggunakan kata kunci "Toko Buah", "Agen Buah", "Pusat Buah", dan "Grosir Buah" pada wilayah Kabupaten Lumajang. Hingga periode pengambilan data penelitian, sistem berhasil mengumpulkan 135 data tempat usaha. Gambar 4.1 menunjukkan dashboard aplikasi Mafaza Fortuna yang merekam ringkasan operasional proses pengumpulan data tersebut.</w:t>
+        <w:t xml:space="preserve">Scraper berbasis Node.js dan Playwright dijalankan terhadap Google Maps memakai empat kata kunci: "Toko Buah", "Agen Buah", "Pusat Buah", dan "Grosir Buah", semuanya dibatasi pada wilayah Kabupaten Lumajang. Sampai periode pengambilan data berakhir, sistem mengumpulkan 135 data tempat usaha. Ringkasan operasionalnya dapat dilihat pada dashboard aplikasi Mafaza Fortuna (Gambar 4.1).</w:t>
       </w:r>
     </w:p>
     <w:p>
@@ -4032,7 +4017,7 @@
           <w:sz w:val="24"/>
           <w:szCs w:val="24"/>
         </w:rPr>
-        <w:t xml:space="preserve">Riwayat dan status proses scraping per kecamatan dapat dipantau melalui halaman Scraping Google Maps, sebagaimana ditunjukkan pada Gambar 4.2. Pada halaman ini terlihat sebanyak 135 tempat telah berhasil di-scrape, dengan 13 tempat baru ditambahkan pada sesi scraping terakhir.</w:t>
+        <w:t xml:space="preserve">Catatan lebih rinci soal proses scraping itu sendiri, mulai dari per kecamatan, kapan dijalankan, sampai berapa data baru yang masuk, tersedia di halaman Scraping Google Maps (Gambar 4.2). Pada sesi terakhir yang tercatat, ada 13 tempat baru yang berhasil ditambahkan, menggenapkan total menjadi 135.</w:t>
       </w:r>
     </w:p>
     <w:p>
@@ -4107,7 +4092,7 @@
           <w:sz w:val="24"/>
           <w:szCs w:val="24"/>
         </w:rPr>
-        <w:t xml:space="preserve">Dari 135 data yang terkumpul, hanya 22 tempat (16,3%) yang memiliki keempat atribut wajib untuk proses clustering, yaitu rating, jumlah ulasan, latitude, dan longitude, secara lengkap. Sebagian besar tempat yang tidak lengkap disebabkan oleh keterbatasan informasi yang ditampilkan Google Maps untuk usaha berskala kecil/informal (misalnya lapak atau stand buah musiman) yang belum memiliki ulasan maupun titik koordinat presisi pada saat scraping dilakukan. Data dengan atribut tidak lengkap tersebut tetap tersimpan sebagai data inventaris tempat usaha, namun tidak diikutkan pada proses clustering tahap ini.</w:t>
+        <w:t xml:space="preserve">Dari 135 data tersebut, ternyata hanya 22 tempat (16,3%) yang punya keempat atribut wajib untuk clustering secara lengkap: rating, jumlah ulasan, latitude, dan longitude. Sisanya kebanyakan adalah usaha berskala kecil atau informal, semisal lapak dan stand buah musiman, yang di Google Maps belum mendapat ulasan apa pun atau titik koordinatnya belum presisi saat scraping berlangsung. Data-data itu tidak dibuang; semuanya tetap tersimpan sebagai inventaris tempat usaha, hanya saja tidak diikutkan pada proses clustering tahap ini.</w:t>
       </w:r>
     </w:p>
     <w:p>
@@ -4140,7 +4125,7 @@
           <w:sz w:val="24"/>
           <w:szCs w:val="24"/>
         </w:rPr>
-        <w:t xml:space="preserve">Hasil scraping menunjukkan keragaman kategori usaha yang berkaitan dengan komoditas buah di Kabupaten Lumajang, antara lain "Grosir Buah", "Toko Buah dan Sayur", "Toko Buah Kering", "Kedai Jus", serta usaha pendukung seperti "Pembibitan Tanaman" dan "Pemasok Peralatan Hidroponik". Keragaman ini mengindikasikan bahwa rantai usaha buah di Kabupaten Lumajang tidak hanya terdiri atas toko retail, tetapi juga melibatkan pelaku usaha grosir dan pendukung produksi yang berpotensi menjadi mitra distribusi dengan karakteristik berbeda.</w:t>
+        <w:t xml:space="preserve">Kategori usaha yang muncul dari hasil scraping cukup beragam: ada "Grosir Buah", "Toko Buah dan Sayur", "Toko Buah Kering", "Kedai Jus", sampai usaha pendukung seperti "Pembibitan Tanaman" dan "Pemasok Peralatan Hidroponik". Artinya, rantai usaha buah di Kabupaten Lumajang tidak berhenti pada toko retail saja. Ada juga pelaku grosir dan usaha pendukung produksi yang sama-sama berpotensi dijadikan mitra distribusi, meski karakteristiknya tentu berbeda satu sama lain.</w:t>
       </w:r>
     </w:p>
     <w:p>
@@ -4155,7 +4140,7 @@
           <w:sz w:val="24"/>
           <w:szCs w:val="24"/>
         </w:rPr>
-        <w:t xml:space="preserve">Secara spasial, persebaran tempat usaha terkonsentrasi pada beberapa kecamatan, terutama Kecamatan Pasirian, Candipuro, dan Tempeh yang merupakan wilayah dengan aktivitas perdagangan hortikultura yang relatif tinggi, sebagaimana terlihat pada visualisasi peta interaktif (Gambar 4.3). Peta tersebut menampilkan seluruh tempat usaha hasil scraping dengan pengelompokan marker berdasarkan kategori, sehingga memudahkan identifikasi area dengan kepadatan usaha buah yang tinggi.</w:t>
+        <w:t xml:space="preserve">Kalau dilihat sebarannya, tempat usaha ini cenderung mengelompok di beberapa kecamatan tertentu, terutama Pasirian, Candipuro, dan Tempeh, tiga wilayah yang memang dikenal cukup aktif dalam perdagangan hortikultura. Gambar 4.3 menampilkan visualisasi peta interaktif yang menunjukkan pola tersebut, dengan marker yang dikelompokkan per kategori sehingga area dengan kepadatan usaha buah tinggi langsung terlihat tanpa perlu menyisir satu per satu titik.</w:t>
       </w:r>
     </w:p>
     <w:p>
@@ -4248,7 +4233,7 @@
           <w:sz w:val="24"/>
           <w:szCs w:val="24"/>
         </w:rPr>
-        <w:t xml:space="preserve">Proses clustering dijalankan terhadap 22 data tempat yang memenuhi syarat kelengkapan atribut, melalui modul Analisis K-Means pada aplikasi (Gambar 4.4). Setelah tahap preprocessing (penghapusan duplikat) dan normalisasi Min-Max terhadap variabel rating, jumlah ulasan, latitude, dan longitude, algoritma K-Means dengan k = 3 menghasilkan tiga cluster yang diberi label Potensi Tinggi, Sedang, dan Rendah berdasarkan peringkat skor gabungan rata-rata rating dan logaritma jumlah ulasan pada setiap cluster.</w:t>
+        <w:t xml:space="preserve">Proses clustering dijalankan terhadap 22 data yang sudah lolos syarat kelengkapan, lewat modul Analisis K-Means pada aplikasi (Gambar 4.4). Setelah duplikat dibuang dan keempat variabel (rating, jumlah ulasan, latitude, longitude) dinormalisasi dengan Min-Max, algoritma K-Means (k = 3) menghasilkan tiga cluster. Masing-masing cluster diberi label Tinggi, Sedang, atau Rendah berdasarkan peringkat skor gabungan rata-rata rating dan logaritma jumlah ulasan.</w:t>
       </w:r>
     </w:p>
     <w:p>
@@ -4323,7 +4308,7 @@
           <w:sz w:val="24"/>
           <w:szCs w:val="24"/>
         </w:rPr>
-        <w:t xml:space="preserve">Tabel 4.1 menunjukkan ringkasan hasil clustering untuk setiap kategori potensi.</w:t>
+        <w:t xml:space="preserve">Ringkasannya ditunjukkan pada Tabel 4.1.</w:t>
       </w:r>
     </w:p>
     <w:p>
@@ -4627,7 +4612,7 @@
           <w:sz w:val="24"/>
           <w:szCs w:val="24"/>
         </w:rPr>
-        <w:t xml:space="preserve">Cluster Potensi Tinggi beranggotakan 6 tempat dengan rata-rata 460,3 ulasan, didominasi oleh pusat perbelanjaan dan pasar tradisional berskala besar seperti Pasar Umum Pasirian (1.235 ulasan) dan Sumber Baru Toserba (835 ulasan). Cluster Potensi Sedang beranggotakan 9 tempat dan cluster Potensi Rendah beranggotakan 7 tempat, keduanya didominasi oleh toko/agen buah berskala kecil dengan rating mendekati sempurna (rata-rata 5,0) namun jumlah ulasan yang jauh lebih sedikit (rata-rata di bawah 2 ulasan). Contoh data sampel dari masing-masing cluster ditunjukkan pada Tabel 4.2.</w:t>
+        <w:t xml:space="preserve">Cluster Tinggi beranggotakan 6 tempat dengan rata-rata 460,3 ulasan, didominasi pasar dan pusat perbelanjaan berskala besar seperti Pasar Umum Pasirian (1.235 ulasan) dan Sumber Baru Toserba (835 ulasan). Cluster Sedang (9 tempat) dan Rendah (7 tempat) ceritanya agak berbeda: keduanya sama-sama berisi toko/agen buah berskala kecil dengan rating yang nyaris sempurna, rata-rata 5,0, tapi jumlah ulasannya jauh lebih sedikit, di bawah 2 ulasan per tempat. Beberapa contoh datanya bisa dilihat pada Tabel 4.2.</w:t>
       </w:r>
     </w:p>
     <w:p>
@@ -5365,7 +5350,7 @@
           <w:sz w:val="24"/>
           <w:szCs w:val="24"/>
         </w:rPr>
-        <w:t xml:space="preserve">Evaluasi model dilakukan menggunakan Elbow Method dan Silhouette Score yang telah diimplementasikan langsung pada modul KMeansService aplikasi. Tabel 4.3 menunjukkan nilai WCSS (Within-Cluster Sum of Squares) untuk k = 1 hingga k = 6.</w:t>
+        <w:t xml:space="preserve">Untuk memeriksa apakah k = 3 memang pilihan yang tepat, dijalankan juga Elbow Method dan Silhouette Score lewat modul KMeansService yang sama. Tabel 4.3 memuat nilai WCSS-nya untuk k = 1 sampai k = 6.</w:t>
       </w:r>
     </w:p>
     <w:p>
@@ -5646,7 +5631,7 @@
           <w:sz w:val="24"/>
           <w:szCs w:val="24"/>
         </w:rPr>
-        <w:t xml:space="preserve">Grafik WCSS menurun secara tajam dari k = 1 (9,0987) hingga k = 3 (2,7068), kemudian penurunannya mulai melandai pada k = 4 hingga k = 6. Pola ini menunjukkan titik siku (elbow point) berada di sekitar k = 3, sehingga pemilihan k = 3 pada penelitian ini cukup beralasan secara statistik, sejalan dengan tujuan penelitian untuk menghasilkan tiga kategori potensi (tinggi, sedang, rendah). Adapun nilai Silhouette Score rata-rata untuk k = 3 pada hasil analisis ini adalah 0,4341, yang berdasarkan kriteria Ezugwu et al. (2022) tergolong pada kategori struktur cluster yang wajar (reasonable structure), meskipun belum optimal — mengindikasikan bahwa sebagian objek pada cluster Sedang dan Rendah memiliki karakteristik rating dan jumlah ulasan yang relatif berdekatan, sehingga sebagian batas antar-cluster terbentuk terutama oleh perbedaan posisi geografis (latitude dan longitude) dibandingkan oleh rating dan jumlah ulasan semata.</w:t>
+        <w:t xml:space="preserve">Polanya cukup jelas: WCSS turun tajam dari k = 1 (9,0987) ke k = 3 (2,7068), lalu mulai melandai begitu masuk k = 4 sampai k = 6. Titik siku grafik ini berada kira-kira di sekitar k = 3, jadi pemilihan k = 3 pada penelitian ini punya dasar yang cukup kuat secara statistik, bukan hanya mengikuti rencana awal membentuk tiga kategori potensi. Untuk Silhouette Score, hasilnya 0,4341 pada k = 3. Menurut kriteria Ezugwu dkk. (2022), angka ini masuk kategori struktur cluster yang wajar (reasonable structure), meski belum bisa dibilang optimal. Nilai yang belum terlalu tinggi ini sebenarnya cukup masuk akal mengingat cluster Sedang dan Rendah memang punya karakteristik rating dan jumlah ulasan yang berdekatan; batas antar-keduanya lebih banyak terbentuk dari perbedaan posisi geografis ketimbang dari rating atau jumlah ulasan semata.</w:t>
       </w:r>
     </w:p>
     <w:p>
@@ -5679,7 +5664,7 @@
           <w:sz w:val="24"/>
           <w:szCs w:val="24"/>
         </w:rPr>
-        <w:t xml:space="preserve">Hasil penelitian ini menunjukkan bahwa data Google Maps dapat dimanfaatkan untuk mengidentifikasi pola persebaran dan tingkat potensi toko buah secara objektif, sejalan dengan temuan Sharda et al. (2024) mengenai pemanfaatan sumber data eksternal berbasis lokasi dalam mendukung business intelligence. Cluster Potensi Tinggi yang didominasi oleh tempat dengan jumlah ulasan jauh lebih besar dibandingkan cluster lainnya memperkuat argumen Filieri et al. (2021) bahwa jumlah dan karakteristik ulasan daring berhubungan dengan tingkat keterlibatan dan kepercayaan konsumen terhadap suatu usaha, sehingga dapat dijadikan indikator awal aktivitas bisnis.</w:t>
+        <w:t xml:space="preserve">Temuan ini sejalan dengan argumen Sharda dkk. (2024) bahwa sumber data eksternal berbasis lokasi, dalam hal ini Google Maps, bisa dimanfaatkan untuk membaca pola bisnis secara lebih objektif dibanding mengandalkan intuisi atau survei manual semata. Cluster Tinggi yang anggotanya punya jumlah ulasan jauh di atas cluster lain juga memperkuat apa yang ditemukan Filieri dkk. (2021): ulasan daring berkaitan dengan tingkat keterlibatan dan kepercayaan konsumen, sehingga cukup layak dijadikan indikator awal aktivitas bisnis suatu tempat.</w:t>
       </w:r>
     </w:p>
     <w:p>
@@ -5694,7 +5679,7 @@
           <w:sz w:val="24"/>
           <w:szCs w:val="24"/>
         </w:rPr>
-        <w:t xml:space="preserve">Namun demikian, ditemukan pula bahwa cluster Sedang dan Rendah memiliki rata-rata rating yang identik (5,0) dengan selisih jumlah ulasan yang kecil, sehingga pemisahan kedua cluster tersebut sebagian besar dipengaruhi oleh kedekatan posisi geografis (latitude dan longitude) dibandingkan oleh karakteristik bisnis itu sendiri. Temuan ini berbeda dari penelitian Wikarta dan Defiyanti (2024) yang mengelompokkan UMKM dengan variasi data yang lebih beragam; pada penelitian ini, keterbatasan variasi rating (banyak tempat kecil yang hanya memiliki 1–2 ulasan dengan rating 5) menjadi salah satu penyebab rendahnya daya pisah (separability) antar-cluster pada kategori menengah ke bawah, sebagaimana tercermin dari nilai Silhouette Score yang berada pada kategori wajar, belum optimal.</w:t>
+        <w:t xml:space="preserve">Tapi ada juga catatan yang perlu digarisbawahi. Cluster Sedang dan Rendah ternyata punya rata-rata rating yang sama persis (5,0), dengan selisih jumlah ulasan yang tipis. Praktis, pemisahan kedua cluster ini lebih banyak ditentukan oleh kedekatan lokasi geografis dibanding karakteristik bisnisnya sendiri. Ini agak berbeda dari hasil Wikarta dan Defiyanti (2024) yang mengelompokkan UMKM dengan variasi data lebih beragam. Penyebabnya cukup masuk akal: banyak tempat berskala kecil di sini hanya punya satu atau dua ulasan dengan rating 5, sehingga variabel rating kehilangan daya pisahnya begitu sampai pada kategori menengah ke bawah. Hal ini juga tercermin dari Silhouette Score yang masih di kategori wajar, bukan optimal.</w:t>
       </w:r>
     </w:p>
     <w:p>
@@ -5709,7 +5694,7 @@
           <w:sz w:val="24"/>
           <w:szCs w:val="24"/>
         </w:rPr>
-        <w:t xml:space="preserve">Secara praktis, hasil clustering ini tetap memberikan nilai guna bagi supplier buah di Kabupaten Lumajang. Tempat-tempat pada cluster Potensi Tinggi — seperti Pasar Umum Pasirian, Sumber Baru Toserba, dan Pasar Kunir — dapat menjadi prioritas utama penjajakan kemitraan karena menunjukkan indikasi volume transaksi dan keterlibatan pelanggan yang jauh lebih besar dibandingkan tempat lainnya. Visualisasi pada peta interaktif (Gambar 4.3) juga membantu supplier memahami konsentrasi geografis tempat-tempat potensial tersebut, terutama di Kecamatan Pasirian, sehingga dapat menyusun rute distribusi yang lebih efisien, sejalan dengan manfaat kombinasi analisis spasial dan clustering yang dikemukakan oleh Pratama et al. (2023).</w:t>
+        <w:t xml:space="preserve">Lepas dari catatan tersebut, hasil clustering ini tetap punya nilai pakai bagi supplier buah di Kabupaten Lumajang. Tempat-tempat pada cluster Tinggi, seperti Pasar Umum Pasirian, Sumber Baru Toserba, dan Pasar Kunir, masuk akal dijadikan prioritas penjajakan kemitraan lebih dulu karena indikasi volume transaksi dan keterlibatan pelanggannya memang jauh lebih besar. Peta interaktif pada Gambar 4.3 turut membantu memahami konsentrasi geografis tempat-tempat itu, terutama di Kecamatan Pasirian, sehingga rute distribusi pun bisa disusun lebih efisien, gagasan yang juga ditekankan Pratama dkk. (2023) lewat kombinasi analisis spasial dan clustering.</w:t>
       </w:r>
     </w:p>
     <w:p>
@@ -5769,7 +5754,7 @@
           <w:sz w:val="24"/>
           <w:szCs w:val="24"/>
         </w:rPr>
-        <w:t xml:space="preserve">Berdasarkan hasil penelitian dan pembahasan yang telah diuraikan, dapat disimpulkan beberapa hal sebagai berikut:</w:t>
+        <w:t xml:space="preserve">Dari hasil dan pembahasan pada bab sebelumnya, ada dua hal pokok yang bisa disimpulkan:</w:t>
       </w:r>
     </w:p>
     <w:p>
@@ -5795,7 +5780,7 @@
           <w:sz w:val="24"/>
           <w:szCs w:val="24"/>
         </w:rPr>
-        <w:t xml:space="preserve">Karakteristik dan pola persebaran spasial toko buah di Kabupaten Lumajang berhasil dipetakan melalui teknik web scraping pada Google Maps, dengan total 135 tempat usaha berhasil dikumpulkan yang terkonsentrasi terutama di Kecamatan Pasirian, Candipuro, dan Tempeh, mencakup beragam kategori usaha mulai dari grosir, toko retail, hingga usaha pendukung produksi buah.</w:t>
+        <w:t xml:space="preserve">pola persebaran spasial toko buah di Kabupaten Lumajang berhasil dipetakan lewat web scraping Google Maps, dengan 135 tempat usaha terkumpul yang terkonsentrasi terutama di Kecamatan Pasirian, Candipuro, dan Tempeh, mencakup beragam kategori mulai dari grosir, toko retail, sampai usaha pendukung produksi buah;</w:t>
       </w:r>
     </w:p>
     <w:p>
@@ -5821,7 +5806,7 @@
           <w:sz w:val="24"/>
           <w:szCs w:val="24"/>
         </w:rPr>
-        <w:t xml:space="preserve">Algoritma K-Means dengan k = 3 berhasil mengelompokkan 22 toko/agen buah yang memiliki data lengkap (rating, jumlah ulasan, latitude, longitude) ke dalam tiga kategori potensi mitra supplier — Tinggi (6 tempat), Sedang (9 tempat), dan Rendah (7 tempat) — yang divalidasi menggunakan Elbow Method (titik siku pada k = 3) dan Silhouette Score (0,4341, kategori struktur cluster wajar). Cluster Potensi Tinggi ditandai oleh jumlah ulasan yang jauh lebih besar dibandingkan cluster lainnya, sehingga dapat dijadikan prioritas utama bagi supplier dalam menjalin kemitraan distribusi.</w:t>
+        <w:t xml:space="preserve">algoritma K-Means (k = 3) berhasil mengelompokkan 22 toko/agen buah yang datanya lengkap ke dalam tiga kategori potensi mitra supplier: Tinggi (6 tempat), Sedang (9 tempat), dan Rendah (7 tempat), divalidasi lewat Elbow Method (titik siku pada k = 3) dan Silhouette Score (0,4341, kategori struktur cluster wajar). Cluster Tinggi menonjol lewat jumlah ulasan yang jauh lebih besar dibanding dua cluster lainnya, dan karena itu pantas dijadikan prioritas utama penjajakan kemitraan oleh supplier.</w:t>
       </w:r>
     </w:p>
     <w:p>
@@ -5854,7 +5839,7 @@
           <w:sz w:val="24"/>
           <w:szCs w:val="24"/>
         </w:rPr>
-        <w:t xml:space="preserve">Penelitian ini memiliki beberapa keterbatasan yang perlu menjadi perhatian pada penelitian selanjutnya:</w:t>
+        <w:t xml:space="preserve">Beberapa keterbatasan berikut perlu dicatat agar hasil penelitian ini dibaca secara proporsional, sekaligus jadi catatan untuk penelitian lanjutan:</w:t>
       </w:r>
     </w:p>
     <w:p>
@@ -5880,7 +5865,7 @@
           <w:sz w:val="24"/>
           <w:szCs w:val="24"/>
         </w:rPr>
-        <w:t xml:space="preserve">Jumlah data yang dapat diproses pada tahap clustering hanya 22 dari 135 tempat (16,3%) yang berhasil di-scraping, karena banyak tempat usaha berskala kecil pada Google Maps belum memiliki rating, ulasan, atau koordinat yang lengkap. Ukuran sampel yang kecil ini berpotensi membatasi generalisasi hasil clustering terhadap keseluruhan populasi toko buah di Kabupaten Lumajang.</w:t>
+        <w:t xml:space="preserve">hanya 22 dari 135 tempat (16,3%) yang datanya cukup lengkap untuk diproses clustering, karena sebagian besar tempat berskala kecil di Google Maps belum punya rating, ulasan, atau koordinat yang lengkap. Ukuran sampel yang kecil ini punya konsekuensi: generalisasi hasil clustering terhadap seluruh populasi toko buah di Kabupaten Lumajang masih terbatas;</w:t>
       </w:r>
     </w:p>
     <w:p>
@@ -5906,7 +5891,7 @@
           <w:sz w:val="24"/>
           <w:szCs w:val="24"/>
         </w:rPr>
-        <w:t xml:space="preserve">Sebagian besar tempat usaha berskala kecil memiliki rating yang seragam (mendekati atau tepat 5,0) dengan jumlah ulasan yang sangat sedikit (1–2 ulasan), sehingga variabel rating kurang memiliki daya pisah (discriminative power) antara cluster Sedang dan Rendah, dan pemisahan kedua cluster tersebut lebih banyak dipengaruhi oleh posisi geografis.</w:t>
+        <w:t xml:space="preserve">rating pada kebanyakan tempat berskala kecil ternyata seragam, mendekati atau tepat 5,0, dengan jumlah ulasan yang sangat minim (1-2 ulasan). Akibatnya variabel rating kurang punya daya pisah antara cluster Sedang dan Rendah, dan pemisahan keduanya lebih banyak ditentukan oleh posisi geografis daripada karakteristik bisnis;</w:t>
       </w:r>
     </w:p>
     <w:p>
@@ -5932,7 +5917,7 @@
           <w:sz w:val="24"/>
           <w:szCs w:val="24"/>
         </w:rPr>
-        <w:t xml:space="preserve">Data penelitian bersifat snapshot pada periode scraping tertentu, sehingga tidak menggambarkan perubahan rating, ulasan, maupun keberadaan usaha secara berkelanjutan (misalnya usaha yang tutup atau baru berdiri setelah periode pengambilan data).</w:t>
+        <w:t xml:space="preserve">data yang dipakai bersifat snapshot pada periode scraping tertentu saja, sehingga tidak menggambarkan perubahan rating, ulasan, atau keberadaan usaha secara berkelanjutan, misalnya toko yang sudah tutup atau yang baru berdiri setelah periode pengambilan data;</w:t>
       </w:r>
     </w:p>
     <w:p>
@@ -5958,7 +5943,7 @@
           <w:sz w:val="24"/>
           <w:szCs w:val="24"/>
         </w:rPr>
-        <w:t xml:space="preserve">Pelabelan kategori potensi (Tinggi/Sedang/Rendah) menggunakan pendekatan ranking heuristik berbasis skor rata-rata rating dan logaritma jumlah ulasan per cluster, bukan label ground-truth dari data transaksi riil, sehingga validitas label tersebut bersifat indikatif dan belum diverifikasi terhadap data penjualan atau volume transaksi aktual.</w:t>
+        <w:t xml:space="preserve">label kategori potensi (Tinggi/Sedang/Rendah) berasal dari ranking heuristik atas skor rata-rata rating dan logaritma jumlah ulasan per cluster, bukan dari data transaksi riil. Artinya label ini bersifat indikatif saja dan belum diverifikasi terhadap data penjualan atau volume transaksi yang sesungguhnya.</w:t>
       </w:r>
     </w:p>
     <w:p>
@@ -6002,7 +5987,7 @@
           <w:sz w:val="24"/>
           <w:szCs w:val="24"/>
         </w:rPr>
-        <w:t xml:space="preserve">Bagi penelitian selanjutnya, disarankan untuk melengkapi data yang belum memiliki rating/koordinat melalui proses rescraping berkala atau verifikasi data manual, sehingga jumlah sampel yang dapat diikutkan pada proses clustering dapat ditingkatkan.</w:t>
+        <w:t xml:space="preserve">untuk penelitian selanjutnya, ada baiknya data yang belum lengkap dilengkapi lebih dulu lewat rescraping berkala atau verifikasi manual, agar jumlah sampel yang masuk ke proses clustering bisa lebih besar dari 22 tempat;</w:t>
       </w:r>
     </w:p>
     <w:p>
@@ -6028,7 +6013,7 @@
           <w:sz w:val="24"/>
           <w:szCs w:val="24"/>
         </w:rPr>
-        <w:t xml:space="preserve">Penelitian selanjutnya dapat menambahkan variabel lain yang tersedia pada Google Maps, seperti jam operasional, kategori usaha secara lebih rinci, atau foto usaha, untuk meningkatkan daya pisah antar-cluster terutama pada kategori dengan rating yang seragam.</w:t>
+        <w:t xml:space="preserve">variabel lain yang tersedia di Google Maps, seperti jam operasional, kategori usaha yang lebih rinci, atau foto usaha, bisa dicoba ditambahkan pada penelitian berikutnya untuk membantu daya pisah antar-cluster, terutama pada kategori yang ratingnya seragam;</w:t>
       </w:r>
     </w:p>
     <w:p>
@@ -6054,7 +6039,7 @@
           <w:sz w:val="24"/>
           <w:szCs w:val="24"/>
         </w:rPr>
-        <w:t xml:space="preserve">Bagi supplier, disarankan untuk memprioritaskan penjajakan kemitraan pada tempat-tempat dalam cluster Potensi Tinggi terlebih dahulu, sembari melakukan validasi lapangan terhadap cluster Sedang dan Rendah mengingat keterbatasan daya pisah pada kedua cluster tersebut.</w:t>
+        <w:t xml:space="preserve">bagi supplier, sebaiknya cluster Tinggi memang diprioritaskan lebih dulu, tapi cluster Sedang dan Rendah tetap perlu divalidasi lewat pengecekan lapangan mengingat daya pisah keduanya yang masih terbatas;</w:t>
       </w:r>
     </w:p>
     <w:p>
@@ -6080,7 +6065,7 @@
           <w:sz w:val="24"/>
           <w:szCs w:val="24"/>
         </w:rPr>
-        <w:t xml:space="preserve">Bagi pengembangan sistem, disarankan untuk menambahkan fitur rescraping otomatis berkala dan validasi kelengkapan data sebelum proses clustering dijalankan, agar jumlah data eligible dapat terus bertambah seiring waktu.</w:t>
+        <w:t xml:space="preserve">bagi pengembangan sistem ke depan, fitur rescraping otomatis berkala dan validasi kelengkapan data sebelum clustering dijalankan akan sangat membantu menambah jumlah data yang eligible dari waktu ke waktu.</w:t>
       </w:r>
     </w:p>
     <w:p>
@@ -6377,7 +6362,7 @@
           <w:sz w:val="24"/>
           <w:szCs w:val="24"/>
         </w:rPr>
-        <w:t xml:space="preserve">[Bagian ini akan dilengkapi pada tahap finalisasi dengan tangkapan layar aplikasi (dashboard, peta interaktif, hasil analisis K-Means, riwayat scraping) serta lampiran data pendukung lainnya — lihat Bab 4.]</w:t>
+        <w:t xml:space="preserve">Tangkapan layar aplikasi (dashboard, peta interaktif, hasil analisis K-Means, riwayat scraping) disajikan langsung pada Bab 4 sebagai bagian dari pembahasan hasil.</w:t>
       </w:r>
     </w:p>
     <w:sectPr>

</xml_diff>